<commit_message>
acreate cards && and download word .docs file and update from modal components
</commit_message>
<xml_diff>
--- a/public/atestat_deplom_app.docx
+++ b/public/atestat_deplom_app.docx
@@ -4,12 +4,960 @@
   <w:body>
     <w:p>
       <w:pPr>
+        <w:spacing w:after="160" w:line="259" w:lineRule="auto"/>
+        <w:ind w:left="0" w:firstLine="0"/>
+        <w:jc w:val="center"/>
+        <w:rPr>
+          <w:sz w:val="20"/>
+          <w:szCs w:val="20"/>
+        </w:rPr>
+      </w:pPr>
+      <w:proofErr w:type="spellStart"/>
+      <w:r>
+        <w:rPr>
+          <w:sz w:val="20"/>
+          <w:szCs w:val="20"/>
+        </w:rPr>
+        <w:t>Негізгі</w:t>
+      </w:r>
+      <w:proofErr w:type="spellEnd"/>
+      <w:r>
+        <w:rPr>
+          <w:sz w:val="20"/>
+          <w:szCs w:val="20"/>
+        </w:rPr>
+        <w:t xml:space="preserve"> орта </w:t>
+      </w:r>
+      <w:proofErr w:type="spellStart"/>
+      <w:r>
+        <w:rPr>
+          <w:sz w:val="20"/>
+          <w:szCs w:val="20"/>
+        </w:rPr>
+        <w:t>білім</w:t>
+      </w:r>
+      <w:proofErr w:type="spellEnd"/>
+      <w:r>
+        <w:rPr>
+          <w:sz w:val="20"/>
+          <w:szCs w:val="20"/>
+        </w:rPr>
+        <w:t xml:space="preserve"> </w:t>
+      </w:r>
+      <w:proofErr w:type="spellStart"/>
+      <w:r>
+        <w:rPr>
+          <w:sz w:val="20"/>
+          <w:szCs w:val="20"/>
+        </w:rPr>
+        <w:t>туралы</w:t>
+      </w:r>
+      <w:proofErr w:type="spellEnd"/>
+      <w:r>
+        <w:rPr>
+          <w:sz w:val="20"/>
+          <w:szCs w:val="20"/>
+        </w:rPr>
+        <w:t xml:space="preserve"> АТТЕСТАТ</w:t>
+      </w:r>
+    </w:p>
+    <w:p>
+      <w:pPr>
         <w:spacing w:after="8" w:line="259" w:lineRule="auto"/>
-        <w:ind w:left="6" w:firstLine="0"/>
+        <w:ind w:left="0" w:firstLine="0"/>
+        <w:rPr>
+          <w:sz w:val="20"/>
+          <w:szCs w:val="20"/>
+        </w:rPr>
+      </w:pPr>
+      <w:r>
+        <w:rPr>
+          <w:sz w:val="20"/>
+          <w:szCs w:val="20"/>
+        </w:rPr>
+        <w:t>{{</w:t>
+      </w:r>
+      <w:r>
+        <w:rPr>
+          <w:sz w:val="20"/>
+          <w:szCs w:val="20"/>
+          <w:lang w:val="en-US"/>
+        </w:rPr>
+        <w:t>series</w:t>
+      </w:r>
+      <w:r>
+        <w:rPr>
+          <w:sz w:val="20"/>
+          <w:szCs w:val="20"/>
+        </w:rPr>
+        <w:t>}}</w:t>
+      </w:r>
+      <w:r>
+        <w:rPr>
+          <w:sz w:val="20"/>
+        </w:rPr>
+        <w:t xml:space="preserve"> </w:t>
+      </w:r>
+      <w:r>
+        <w:rPr>
+          <w:sz w:val="20"/>
+          <w:szCs w:val="20"/>
+        </w:rPr>
+        <w:t xml:space="preserve">БТ </w:t>
+      </w:r>
+      <w:r>
+        <w:rPr>
+          <w:sz w:val="20"/>
+          <w:szCs w:val="20"/>
+        </w:rPr>
+        <w:t xml:space="preserve">№ </w:t>
+      </w:r>
+      <w:r>
+        <w:rPr>
+          <w:sz w:val="20"/>
+          <w:szCs w:val="20"/>
+        </w:rPr>
+        <w:t>{{</w:t>
+      </w:r>
+      <w:r>
+        <w:rPr>
+          <w:sz w:val="20"/>
+          <w:szCs w:val="20"/>
+          <w:lang w:val="en-US"/>
+        </w:rPr>
+        <w:t>number</w:t>
+      </w:r>
+      <w:r>
+        <w:rPr>
+          <w:sz w:val="20"/>
+          <w:szCs w:val="20"/>
+        </w:rPr>
+        <w:t>}}</w:t>
+      </w:r>
+    </w:p>
+    <w:p>
+      <w:pPr>
+        <w:spacing w:after="8" w:line="259" w:lineRule="auto"/>
+        <w:ind w:left="0" w:firstLine="0"/>
+        <w:rPr>
+          <w:sz w:val="20"/>
+          <w:szCs w:val="20"/>
+        </w:rPr>
+      </w:pPr>
+      <w:r>
+        <w:rPr>
+          <w:sz w:val="20"/>
+          <w:szCs w:val="20"/>
+        </w:rPr>
+        <w:t xml:space="preserve"> Осы аттестат {{</w:t>
+      </w:r>
+      <w:r>
+        <w:rPr>
+          <w:sz w:val="20"/>
+          <w:szCs w:val="20"/>
+          <w:lang w:val="en-US"/>
+        </w:rPr>
+        <w:t>gradYear</w:t>
+      </w:r>
+      <w:r>
+        <w:rPr>
+          <w:sz w:val="20"/>
+          <w:szCs w:val="20"/>
+        </w:rPr>
+        <w:t>}}</w:t>
+      </w:r>
+      <w:r>
+        <w:t xml:space="preserve"> </w:t>
+      </w:r>
+      <w:proofErr w:type="spellStart"/>
+      <w:r>
+        <w:rPr>
+          <w:sz w:val="20"/>
+          <w:szCs w:val="20"/>
+        </w:rPr>
+        <w:t>жылы</w:t>
+      </w:r>
+      <w:proofErr w:type="spellEnd"/>
+      <w:r>
+        <w:rPr>
+          <w:sz w:val="20"/>
+          <w:szCs w:val="20"/>
+        </w:rPr>
+        <w:t xml:space="preserve"> </w:t>
+      </w:r>
+      <w:r>
+        <w:rPr>
+          <w:sz w:val="20"/>
+          <w:szCs w:val="20"/>
+        </w:rPr>
+        <w:t>{{</w:t>
+      </w:r>
+      <w:r>
+        <w:rPr>
+          <w:sz w:val="20"/>
+          <w:szCs w:val="20"/>
+          <w:lang w:val="en-US"/>
+        </w:rPr>
+        <w:t>schoolName</w:t>
+      </w:r>
+      <w:r>
+        <w:rPr>
+          <w:sz w:val="20"/>
+          <w:szCs w:val="20"/>
+        </w:rPr>
+        <w:t>}}</w:t>
+      </w:r>
+    </w:p>
+    <w:p>
+      <w:pPr>
+        <w:spacing w:after="160" w:line="259" w:lineRule="auto"/>
+        <w:ind w:left="0" w:firstLine="0"/>
+        <w:rPr>
+          <w:sz w:val="20"/>
+          <w:szCs w:val="20"/>
+        </w:rPr>
+      </w:pPr>
+      <w:r>
+        <w:rPr>
+          <w:sz w:val="20"/>
+          <w:szCs w:val="20"/>
+        </w:rPr>
+        <w:t xml:space="preserve"> (</w:t>
+      </w:r>
+      <w:proofErr w:type="spellStart"/>
+      <w:r>
+        <w:rPr>
+          <w:sz w:val="20"/>
+          <w:szCs w:val="20"/>
+        </w:rPr>
+        <w:t>білім</w:t>
+      </w:r>
+      <w:proofErr w:type="spellEnd"/>
+      <w:r>
+        <w:rPr>
+          <w:sz w:val="20"/>
+          <w:szCs w:val="20"/>
+        </w:rPr>
+        <w:t xml:space="preserve"> беру </w:t>
+      </w:r>
+      <w:proofErr w:type="spellStart"/>
+      <w:r>
+        <w:rPr>
+          <w:sz w:val="20"/>
+          <w:szCs w:val="20"/>
+        </w:rPr>
+        <w:t>ұйымының</w:t>
+      </w:r>
+      <w:proofErr w:type="spellEnd"/>
+      <w:r>
+        <w:rPr>
+          <w:sz w:val="20"/>
+          <w:szCs w:val="20"/>
+        </w:rPr>
+        <w:t xml:space="preserve"> (</w:t>
+      </w:r>
+      <w:proofErr w:type="spellStart"/>
+      <w:r>
+        <w:rPr>
+          <w:sz w:val="20"/>
+          <w:szCs w:val="20"/>
+        </w:rPr>
+        <w:t>мектебінің</w:t>
+      </w:r>
+      <w:proofErr w:type="spellEnd"/>
+      <w:r>
+        <w:rPr>
+          <w:sz w:val="20"/>
+          <w:szCs w:val="20"/>
+        </w:rPr>
+        <w:t xml:space="preserve">) </w:t>
+      </w:r>
+      <w:proofErr w:type="spellStart"/>
+      <w:r>
+        <w:rPr>
+          <w:sz w:val="20"/>
+          <w:szCs w:val="20"/>
+        </w:rPr>
+        <w:t>толық</w:t>
+      </w:r>
+      <w:proofErr w:type="spellEnd"/>
+      <w:r>
+        <w:rPr>
+          <w:sz w:val="20"/>
+          <w:szCs w:val="20"/>
+        </w:rPr>
+        <w:t xml:space="preserve"> </w:t>
+      </w:r>
+      <w:proofErr w:type="spellStart"/>
+      <w:r>
+        <w:rPr>
+          <w:sz w:val="20"/>
+          <w:szCs w:val="20"/>
+        </w:rPr>
+        <w:t>атауы</w:t>
+      </w:r>
+      <w:proofErr w:type="spellEnd"/>
+      <w:r>
+        <w:rPr>
+          <w:sz w:val="20"/>
+          <w:szCs w:val="20"/>
+        </w:rPr>
+        <w:t>)</w:t>
+      </w:r>
+      <w:r>
+        <w:rPr>
+          <w:sz w:val="20"/>
+          <w:szCs w:val="20"/>
+        </w:rPr>
+        <w:t xml:space="preserve"> </w:t>
+      </w:r>
+      <w:proofErr w:type="spellStart"/>
+      <w:r>
+        <w:rPr>
+          <w:sz w:val="20"/>
+          <w:szCs w:val="20"/>
+        </w:rPr>
+        <w:t>бітірген</w:t>
+      </w:r>
+      <w:proofErr w:type="spellEnd"/>
+      <w:r>
+        <w:rPr>
+          <w:sz w:val="20"/>
+          <w:szCs w:val="20"/>
+        </w:rPr>
+        <w:t xml:space="preserve"> </w:t>
+      </w:r>
+    </w:p>
+    <w:p>
+      <w:pPr>
+        <w:spacing w:after="160" w:line="259" w:lineRule="auto"/>
+        <w:ind w:left="0" w:firstLine="0"/>
+        <w:rPr>
+          <w:sz w:val="20"/>
+          <w:szCs w:val="20"/>
+        </w:rPr>
+      </w:pPr>
+      <w:r>
+        <w:rPr>
+          <w:sz w:val="20"/>
+          <w:szCs w:val="20"/>
+        </w:rPr>
+        <w:t>{{</w:t>
+      </w:r>
+      <w:r>
+        <w:rPr>
+          <w:sz w:val="20"/>
+          <w:szCs w:val="20"/>
+          <w:lang w:val="en-US"/>
+        </w:rPr>
+        <w:t>lastName</w:t>
+      </w:r>
+      <w:r>
+        <w:rPr>
+          <w:sz w:val="20"/>
+          <w:szCs w:val="20"/>
+        </w:rPr>
+        <w:t>}} {{</w:t>
+      </w:r>
+      <w:r>
+        <w:rPr>
+          <w:sz w:val="20"/>
+          <w:szCs w:val="20"/>
+          <w:lang w:val="en-US"/>
+        </w:rPr>
+        <w:t>firstName</w:t>
+      </w:r>
+      <w:r>
+        <w:rPr>
+          <w:sz w:val="20"/>
+          <w:szCs w:val="20"/>
+        </w:rPr>
+        <w:t>}} {{</w:t>
+      </w:r>
+      <w:r>
+        <w:rPr>
+          <w:sz w:val="20"/>
+          <w:szCs w:val="20"/>
+          <w:lang w:val="en-US"/>
+        </w:rPr>
+        <w:t>middleName</w:t>
+      </w:r>
+      <w:r>
+        <w:rPr>
+          <w:sz w:val="20"/>
+          <w:szCs w:val="20"/>
+        </w:rPr>
+        <w:t>}}</w:t>
+      </w:r>
+      <w:r>
+        <w:rPr>
+          <w:sz w:val="20"/>
+          <w:szCs w:val="20"/>
+        </w:rPr>
+        <w:t xml:space="preserve"> </w:t>
+      </w:r>
+    </w:p>
+    <w:p>
+      <w:pPr>
+        <w:spacing w:after="160" w:line="259" w:lineRule="auto"/>
+        <w:ind w:left="0" w:firstLine="0"/>
+        <w:rPr>
+          <w:sz w:val="20"/>
+          <w:szCs w:val="20"/>
+        </w:rPr>
+      </w:pPr>
+      <w:r>
+        <w:rPr>
+          <w:sz w:val="20"/>
+          <w:szCs w:val="20"/>
+        </w:rPr>
+        <w:t>(</w:t>
+      </w:r>
+      <w:proofErr w:type="spellStart"/>
+      <w:r>
+        <w:rPr>
+          <w:sz w:val="20"/>
+          <w:szCs w:val="20"/>
+        </w:rPr>
+        <w:t>тегі</w:t>
+      </w:r>
+      <w:proofErr w:type="spellEnd"/>
+      <w:r>
+        <w:rPr>
+          <w:sz w:val="20"/>
+          <w:szCs w:val="20"/>
+        </w:rPr>
+        <w:t xml:space="preserve">, </w:t>
+      </w:r>
+      <w:proofErr w:type="spellStart"/>
+      <w:r>
+        <w:rPr>
+          <w:sz w:val="20"/>
+          <w:szCs w:val="20"/>
+        </w:rPr>
+        <w:t>аты</w:t>
+      </w:r>
+      <w:proofErr w:type="spellEnd"/>
+      <w:r>
+        <w:rPr>
+          <w:sz w:val="20"/>
+          <w:szCs w:val="20"/>
+        </w:rPr>
+        <w:t xml:space="preserve">, </w:t>
+      </w:r>
+      <w:proofErr w:type="spellStart"/>
+      <w:r>
+        <w:rPr>
+          <w:sz w:val="20"/>
+          <w:szCs w:val="20"/>
+        </w:rPr>
+        <w:t>әкесінің</w:t>
+      </w:r>
+      <w:proofErr w:type="spellEnd"/>
+      <w:r>
+        <w:rPr>
+          <w:sz w:val="20"/>
+          <w:szCs w:val="20"/>
+        </w:rPr>
+        <w:t xml:space="preserve"> </w:t>
+      </w:r>
+      <w:proofErr w:type="spellStart"/>
+      <w:r>
+        <w:rPr>
+          <w:sz w:val="20"/>
+          <w:szCs w:val="20"/>
+        </w:rPr>
+        <w:t>аты</w:t>
+      </w:r>
+      <w:proofErr w:type="spellEnd"/>
+      <w:r>
+        <w:rPr>
+          <w:sz w:val="20"/>
+          <w:szCs w:val="20"/>
+        </w:rPr>
+        <w:t>) (</w:t>
+      </w:r>
+      <w:proofErr w:type="spellStart"/>
+      <w:r>
+        <w:rPr>
+          <w:sz w:val="20"/>
+          <w:szCs w:val="20"/>
+        </w:rPr>
+        <w:t>болған</w:t>
+      </w:r>
+      <w:proofErr w:type="spellEnd"/>
+      <w:r>
+        <w:rPr>
+          <w:sz w:val="20"/>
+          <w:szCs w:val="20"/>
+        </w:rPr>
+        <w:t xml:space="preserve"> </w:t>
+      </w:r>
+      <w:proofErr w:type="spellStart"/>
+      <w:r>
+        <w:rPr>
+          <w:sz w:val="20"/>
+          <w:szCs w:val="20"/>
+        </w:rPr>
+        <w:t>жағдайда</w:t>
+      </w:r>
+      <w:proofErr w:type="spellEnd"/>
+      <w:r>
+        <w:rPr>
+          <w:sz w:val="20"/>
+          <w:szCs w:val="20"/>
+        </w:rPr>
+        <w:t>)</w:t>
+      </w:r>
+      <w:r>
+        <w:rPr>
+          <w:sz w:val="20"/>
+          <w:szCs w:val="20"/>
+        </w:rPr>
+        <w:t xml:space="preserve"> </w:t>
+      </w:r>
+      <w:proofErr w:type="spellStart"/>
+      <w:r>
+        <w:rPr>
+          <w:sz w:val="20"/>
+          <w:szCs w:val="20"/>
+        </w:rPr>
+        <w:t>берілді</w:t>
+      </w:r>
+      <w:proofErr w:type="spellEnd"/>
+      <w:r>
+        <w:rPr>
+          <w:sz w:val="20"/>
+          <w:szCs w:val="20"/>
+        </w:rPr>
+        <w:t>.</w:t>
+      </w:r>
+    </w:p>
+    <w:p>
+      <w:pPr>
+        <w:spacing w:after="160" w:line="259" w:lineRule="auto"/>
+        <w:ind w:left="0" w:firstLine="0"/>
+        <w:rPr>
+          <w:sz w:val="20"/>
+          <w:szCs w:val="20"/>
+        </w:rPr>
+      </w:pPr>
+      <w:r>
+        <w:rPr>
+          <w:sz w:val="20"/>
+          <w:szCs w:val="20"/>
+        </w:rPr>
+        <w:t xml:space="preserve"> Директор</w:t>
+      </w:r>
+      <w:r>
+        <w:rPr>
+          <w:sz w:val="20"/>
+          <w:szCs w:val="20"/>
+        </w:rPr>
+        <w:t xml:space="preserve"> </w:t>
+      </w:r>
+      <w:r>
+        <w:rPr>
+          <w:sz w:val="20"/>
+          <w:szCs w:val="20"/>
+        </w:rPr>
+        <w:t>{{</w:t>
+      </w:r>
+      <w:r>
+        <w:rPr>
+          <w:sz w:val="20"/>
+          <w:szCs w:val="20"/>
+          <w:lang w:val="en-US"/>
+        </w:rPr>
+        <w:t>directorName</w:t>
+      </w:r>
+      <w:r>
+        <w:rPr>
+          <w:sz w:val="20"/>
+          <w:szCs w:val="20"/>
+        </w:rPr>
+        <w:t>}}</w:t>
+      </w:r>
+    </w:p>
+    <w:p>
+      <w:pPr>
+        <w:spacing w:after="160" w:line="259" w:lineRule="auto"/>
+        <w:ind w:left="0" w:firstLine="0"/>
+        <w:rPr>
+          <w:sz w:val="20"/>
+          <w:szCs w:val="20"/>
+        </w:rPr>
+      </w:pPr>
+      <w:r>
+        <w:rPr>
+          <w:sz w:val="20"/>
+          <w:szCs w:val="20"/>
+        </w:rPr>
+        <w:t xml:space="preserve"> </w:t>
+      </w:r>
+      <w:proofErr w:type="spellStart"/>
+      <w:r>
+        <w:rPr>
+          <w:sz w:val="20"/>
+          <w:szCs w:val="20"/>
+        </w:rPr>
+        <w:t>Директордың</w:t>
+      </w:r>
+      <w:proofErr w:type="spellEnd"/>
+      <w:r>
+        <w:rPr>
+          <w:sz w:val="20"/>
+          <w:szCs w:val="20"/>
+        </w:rPr>
+        <w:t xml:space="preserve"> </w:t>
+      </w:r>
+      <w:proofErr w:type="spellStart"/>
+      <w:r>
+        <w:rPr>
+          <w:sz w:val="20"/>
+          <w:szCs w:val="20"/>
+        </w:rPr>
+        <w:t>орынбасары</w:t>
+      </w:r>
+      <w:proofErr w:type="spellEnd"/>
+      <w:r>
+        <w:rPr>
+          <w:sz w:val="20"/>
+          <w:szCs w:val="20"/>
+        </w:rPr>
+        <w:t xml:space="preserve"> </w:t>
+      </w:r>
+      <w:r>
+        <w:rPr>
+          <w:sz w:val="20"/>
+          <w:szCs w:val="20"/>
+        </w:rPr>
+        <w:t>{{</w:t>
+      </w:r>
+      <w:r>
+        <w:rPr>
+          <w:sz w:val="20"/>
+          <w:szCs w:val="20"/>
+          <w:lang w:val="en-US"/>
+        </w:rPr>
+        <w:t>deputyName</w:t>
+      </w:r>
+      <w:r>
+        <w:rPr>
+          <w:sz w:val="20"/>
+          <w:szCs w:val="20"/>
+        </w:rPr>
+        <w:t>}}</w:t>
+      </w:r>
+    </w:p>
+    <w:p>
+      <w:pPr>
+        <w:spacing w:after="0" w:line="267" w:lineRule="auto"/>
+        <w:ind w:left="0" w:right="220" w:firstLine="0"/>
+        <w:rPr>
+          <w:sz w:val="20"/>
+          <w:szCs w:val="20"/>
+        </w:rPr>
+      </w:pPr>
+      <w:r>
+        <w:rPr>
+          <w:sz w:val="20"/>
+          <w:szCs w:val="20"/>
+        </w:rPr>
+        <w:t xml:space="preserve"> </w:t>
+      </w:r>
+      <w:proofErr w:type="spellStart"/>
+      <w:r>
+        <w:rPr>
+          <w:sz w:val="20"/>
+          <w:szCs w:val="20"/>
+        </w:rPr>
+        <w:t>Сынып</w:t>
+      </w:r>
+      <w:proofErr w:type="spellEnd"/>
+      <w:r>
+        <w:rPr>
+          <w:sz w:val="20"/>
+          <w:szCs w:val="20"/>
+        </w:rPr>
+        <w:t xml:space="preserve"> </w:t>
+      </w:r>
+      <w:proofErr w:type="spellStart"/>
+      <w:r>
+        <w:rPr>
+          <w:sz w:val="20"/>
+          <w:szCs w:val="20"/>
+        </w:rPr>
+        <w:t>жетекшісі</w:t>
+      </w:r>
+      <w:proofErr w:type="spellEnd"/>
+      <w:r>
+        <w:rPr>
+          <w:sz w:val="20"/>
+          <w:szCs w:val="20"/>
+        </w:rPr>
+        <w:t xml:space="preserve"> </w:t>
+      </w:r>
+      <w:r>
+        <w:rPr>
+          <w:sz w:val="20"/>
+          <w:szCs w:val="20"/>
+        </w:rPr>
+        <w:t>{{</w:t>
+      </w:r>
+      <w:r>
+        <w:rPr>
+          <w:sz w:val="20"/>
+          <w:szCs w:val="20"/>
+          <w:lang w:val="en-US"/>
+        </w:rPr>
+        <w:t>classLeaderName</w:t>
+      </w:r>
+      <w:r>
+        <w:rPr>
+          <w:sz w:val="20"/>
+          <w:szCs w:val="20"/>
+        </w:rPr>
+        <w:t>}}</w:t>
+      </w:r>
+      <w:r>
+        <w:rPr>
+          <w:sz w:val="20"/>
+          <w:szCs w:val="20"/>
+        </w:rPr>
+        <w:t xml:space="preserve"> / М.О.</w:t>
+      </w:r>
+    </w:p>
+    <w:p>
+      <w:pPr>
+        <w:spacing w:after="0" w:line="267" w:lineRule="auto"/>
+        <w:ind w:left="0" w:right="220" w:firstLine="0"/>
+      </w:pPr>
+      <w:r>
+        <w:rPr>
+          <w:sz w:val="20"/>
+          <w:szCs w:val="20"/>
+        </w:rPr>
+        <w:t xml:space="preserve"> </w:t>
+      </w:r>
+      <w:proofErr w:type="spellStart"/>
+      <w:r>
+        <w:rPr>
+          <w:sz w:val="20"/>
+          <w:szCs w:val="20"/>
+        </w:rPr>
+        <w:t>Елді</w:t>
+      </w:r>
+      <w:proofErr w:type="spellEnd"/>
+      <w:r>
+        <w:rPr>
+          <w:sz w:val="20"/>
+          <w:szCs w:val="20"/>
+        </w:rPr>
+        <w:t xml:space="preserve"> </w:t>
+      </w:r>
+      <w:proofErr w:type="spellStart"/>
+      <w:r>
+        <w:rPr>
+          <w:sz w:val="20"/>
+          <w:szCs w:val="20"/>
+        </w:rPr>
+        <w:t>мекен</w:t>
+      </w:r>
+      <w:proofErr w:type="spellEnd"/>
+      <w:r>
+        <w:rPr>
+          <w:sz w:val="20"/>
+          <w:szCs w:val="20"/>
+        </w:rPr>
+        <w:t xml:space="preserve"> </w:t>
+      </w:r>
+      <w:r>
+        <w:rPr>
+          <w:sz w:val="20"/>
+          <w:szCs w:val="20"/>
+        </w:rPr>
+        <w:t>{{</w:t>
+      </w:r>
+      <w:r>
+        <w:rPr>
+          <w:sz w:val="20"/>
+          <w:szCs w:val="20"/>
+          <w:lang w:val="en-US"/>
+        </w:rPr>
+        <w:t>city</w:t>
+      </w:r>
+      <w:r>
+        <w:rPr>
+          <w:sz w:val="20"/>
+          <w:szCs w:val="20"/>
+        </w:rPr>
+        <w:t>}}</w:t>
+      </w:r>
+    </w:p>
+    <w:p>
+      <w:pPr>
+        <w:spacing w:after="160" w:line="259" w:lineRule="auto"/>
+        <w:ind w:left="0" w:firstLine="0"/>
+        <w:rPr>
+          <w:sz w:val="20"/>
+          <w:szCs w:val="20"/>
+        </w:rPr>
+      </w:pPr>
+      <w:r>
+        <w:rPr>
+          <w:sz w:val="20"/>
+          <w:szCs w:val="20"/>
+        </w:rPr>
+        <w:t xml:space="preserve">  </w:t>
+      </w:r>
+      <w:proofErr w:type="spellStart"/>
+      <w:r>
+        <w:rPr>
+          <w:sz w:val="20"/>
+          <w:szCs w:val="20"/>
+        </w:rPr>
+        <w:t>жылғы</w:t>
+      </w:r>
+      <w:proofErr w:type="spellEnd"/>
+      <w:r>
+        <w:rPr>
+          <w:sz w:val="20"/>
+          <w:szCs w:val="20"/>
+        </w:rPr>
+        <w:t xml:space="preserve"> "</w:t>
+      </w:r>
+      <w:r>
+        <w:rPr>
+          <w:sz w:val="20"/>
+          <w:szCs w:val="20"/>
+        </w:rPr>
+        <w:t>{{</w:t>
+      </w:r>
+      <w:r>
+        <w:rPr>
+          <w:sz w:val="20"/>
+          <w:szCs w:val="20"/>
+          <w:lang w:val="en-US"/>
+        </w:rPr>
+        <w:t>issueDate</w:t>
+      </w:r>
+      <w:r>
+        <w:rPr>
+          <w:sz w:val="20"/>
+          <w:szCs w:val="20"/>
+        </w:rPr>
+        <w:t>}}</w:t>
+      </w:r>
+      <w:r>
+        <w:rPr>
+          <w:sz w:val="20"/>
+          <w:szCs w:val="20"/>
+        </w:rPr>
+        <w:t xml:space="preserve">" </w:t>
+      </w:r>
+    </w:p>
+    <w:p>
+      <w:pPr>
+        <w:spacing w:after="160" w:line="259" w:lineRule="auto"/>
+        <w:ind w:left="0" w:firstLine="0"/>
+        <w:rPr>
+          <w:sz w:val="20"/>
+          <w:szCs w:val="20"/>
+        </w:rPr>
+      </w:pPr>
+      <w:r>
+        <w:rPr>
+          <w:sz w:val="20"/>
+          <w:szCs w:val="20"/>
+        </w:rPr>
+        <w:t xml:space="preserve"> </w:t>
+      </w:r>
+      <w:proofErr w:type="spellStart"/>
+      <w:r>
+        <w:rPr>
+          <w:sz w:val="20"/>
+          <w:szCs w:val="20"/>
+        </w:rPr>
+        <w:t>берілді</w:t>
+      </w:r>
+      <w:proofErr w:type="spellEnd"/>
+      <w:r>
+        <w:rPr>
+          <w:sz w:val="20"/>
+          <w:szCs w:val="20"/>
+        </w:rPr>
+        <w:t xml:space="preserve">. </w:t>
+      </w:r>
+      <w:proofErr w:type="spellStart"/>
+      <w:r>
+        <w:rPr>
+          <w:sz w:val="20"/>
+          <w:szCs w:val="20"/>
+        </w:rPr>
+        <w:t>Тіркеунөмірі</w:t>
+      </w:r>
+      <w:proofErr w:type="spellEnd"/>
+      <w:r>
+        <w:rPr>
+          <w:sz w:val="20"/>
+          <w:szCs w:val="20"/>
+        </w:rPr>
+        <w:t xml:space="preserve"> № </w:t>
+      </w:r>
+      <w:r>
+        <w:rPr>
+          <w:sz w:val="20"/>
+          <w:szCs w:val="20"/>
+        </w:rPr>
+        <w:t>{{</w:t>
+      </w:r>
+      <w:r>
+        <w:rPr>
+          <w:sz w:val="20"/>
+          <w:szCs w:val="20"/>
+          <w:lang w:val="en-US"/>
+        </w:rPr>
+        <w:t>regNumber</w:t>
+      </w:r>
+      <w:r>
+        <w:rPr>
+          <w:sz w:val="20"/>
+          <w:szCs w:val="20"/>
+        </w:rPr>
+        <w:t>}}</w:t>
+      </w:r>
+    </w:p>
+    <w:p>
+      <w:pPr>
+        <w:spacing w:after="160" w:line="259" w:lineRule="auto"/>
+        <w:ind w:left="0" w:firstLine="0"/>
+        <w:rPr>
+          <w:sz w:val="20"/>
+          <w:szCs w:val="20"/>
+        </w:rPr>
+      </w:pPr>
+    </w:p>
+    <w:p>
+      <w:pPr>
+        <w:spacing w:after="160" w:line="259" w:lineRule="auto"/>
+        <w:ind w:left="0" w:firstLine="0"/>
+        <w:rPr>
+          <w:sz w:val="20"/>
+          <w:szCs w:val="20"/>
+        </w:rPr>
+      </w:pPr>
+    </w:p>
+    <w:p>
+      <w:pPr>
+        <w:spacing w:after="160" w:line="259" w:lineRule="auto"/>
+        <w:ind w:left="0" w:firstLine="0"/>
         <w:jc w:val="center"/>
-      </w:pPr>
-      <w:bookmarkStart w:id="0" w:name="_GoBack"/>
-      <w:bookmarkEnd w:id="0"/>
+        <w:rPr>
+          <w:sz w:val="20"/>
+          <w:szCs w:val="20"/>
+        </w:rPr>
+      </w:pPr>
       <w:r>
         <w:rPr>
           <w:sz w:val="20"/>
@@ -33,14 +981,31 @@
     <w:p>
       <w:pPr>
         <w:spacing w:after="0" w:line="278" w:lineRule="auto"/>
-        <w:ind w:left="0" w:firstLine="604"/>
-      </w:pPr>
-      <w:r>
-        <w:rPr>
-          <w:sz w:val="20"/>
-          <w:szCs w:val="20"/>
-        </w:rPr>
-        <w:t>{{series}}</w:t>
+        <w:rPr>
+          <w:sz w:val="20"/>
+        </w:rPr>
+      </w:pPr>
+      <w:r>
+        <w:rPr>
+          <w:sz w:val="20"/>
+          <w:szCs w:val="20"/>
+        </w:rPr>
+        <w:t>{{</w:t>
+      </w:r>
+      <w:r>
+        <w:rPr>
+          <w:sz w:val="20"/>
+          <w:szCs w:val="20"/>
+          <w:lang w:val="en-US"/>
+        </w:rPr>
+        <w:t>series</w:t>
+      </w:r>
+      <w:r>
+        <w:rPr>
+          <w:sz w:val="20"/>
+          <w:szCs w:val="20"/>
+        </w:rPr>
+        <w:t>}}</w:t>
       </w:r>
       <w:r>
         <w:rPr>
@@ -53,20 +1018,100 @@
           <w:sz w:val="20"/>
           <w:szCs w:val="20"/>
         </w:rPr>
-        <w:t>{{number}}</w:t>
-      </w:r>
-      <w:r>
-        <w:rPr>
-          <w:sz w:val="20"/>
-        </w:rPr>
-        <w:t xml:space="preserve"> Настоящий аттестат выдан </w:t>
-      </w:r>
-      <w:r>
-        <w:rPr>
-          <w:sz w:val="20"/>
-          <w:szCs w:val="20"/>
-        </w:rPr>
-        <w:t>{{lastName}} {{firstName}} {{middleName}}</w:t>
+        <w:t>{{</w:t>
+      </w:r>
+      <w:r>
+        <w:rPr>
+          <w:sz w:val="20"/>
+          <w:szCs w:val="20"/>
+          <w:lang w:val="en-US"/>
+        </w:rPr>
+        <w:t>number</w:t>
+      </w:r>
+      <w:r>
+        <w:rPr>
+          <w:sz w:val="20"/>
+          <w:szCs w:val="20"/>
+        </w:rPr>
+        <w:t>}}</w:t>
+      </w:r>
+      <w:r>
+        <w:rPr>
+          <w:sz w:val="20"/>
+        </w:rPr>
+        <w:t xml:space="preserve"> </w:t>
+      </w:r>
+    </w:p>
+    <w:p>
+      <w:pPr>
+        <w:spacing w:after="0" w:line="278" w:lineRule="auto"/>
+        <w:rPr>
+          <w:sz w:val="20"/>
+        </w:rPr>
+      </w:pPr>
+      <w:r>
+        <w:rPr>
+          <w:sz w:val="20"/>
+        </w:rPr>
+        <w:t xml:space="preserve">Настоящий аттестат выдан </w:t>
+      </w:r>
+    </w:p>
+    <w:p>
+      <w:pPr>
+        <w:spacing w:after="0" w:line="278" w:lineRule="auto"/>
+        <w:ind w:left="0" w:firstLine="0"/>
+      </w:pPr>
+      <w:r>
+        <w:rPr>
+          <w:sz w:val="20"/>
+          <w:szCs w:val="20"/>
+        </w:rPr>
+        <w:t>{{</w:t>
+      </w:r>
+      <w:r>
+        <w:rPr>
+          <w:sz w:val="20"/>
+          <w:szCs w:val="20"/>
+          <w:lang w:val="en-US"/>
+        </w:rPr>
+        <w:t>lastName</w:t>
+      </w:r>
+      <w:r>
+        <w:rPr>
+          <w:sz w:val="20"/>
+          <w:szCs w:val="20"/>
+        </w:rPr>
+        <w:t>}} {{</w:t>
+      </w:r>
+      <w:r>
+        <w:rPr>
+          <w:sz w:val="20"/>
+          <w:szCs w:val="20"/>
+          <w:lang w:val="en-US"/>
+        </w:rPr>
+        <w:t>firstName</w:t>
+      </w:r>
+      <w:r>
+        <w:rPr>
+          <w:sz w:val="20"/>
+          <w:szCs w:val="20"/>
+        </w:rPr>
+        <w:t>}} {{</w:t>
+      </w:r>
+      <w:r>
+        <w:rPr>
+          <w:sz w:val="20"/>
+          <w:szCs w:val="20"/>
+          <w:lang w:val="en-US"/>
+        </w:rPr>
+        <w:t>middleName</w:t>
+      </w:r>
+      <w:r>
+        <w:rPr>
+          <w:sz w:val="20"/>
+          <w:szCs w:val="20"/>
+        </w:rPr>
+        <w:t>}}</w:t>
       </w:r>
       <w:r>
         <w:rPr>
@@ -96,7 +1141,7 @@
         <w:rPr>
           <w:sz w:val="20"/>
         </w:rPr>
-        <w:t xml:space="preserve">__________________________________ окончившему (-ей) в </w:t>
+        <w:t xml:space="preserve">окончившему (-ей) в </w:t>
       </w:r>
       <w:r>
         <w:rPr>
@@ -105,7 +1150,24 @@
           <w:sz w:val="20"/>
           <w:szCs w:val="20"/>
         </w:rPr>
-        <w:t>{{gradYear}}</w:t>
+        <w:t>{{</w:t>
+      </w:r>
+      <w:r>
+        <w:rPr>
+          <w:sz w:val="20"/>
+          <w:szCs w:val="20"/>
+          <w:lang w:val="en-US"/>
+        </w:rPr>
+        <w:t>gradYear</w:t>
+      </w:r>
+      <w:r>
+        <w:rPr>
+          <w:b/>
+          <w:bCs/>
+          <w:sz w:val="20"/>
+          <w:szCs w:val="20"/>
+        </w:rPr>
+        <w:t>}}</w:t>
       </w:r>
       <w:r>
         <w:rPr>
@@ -128,7 +1190,22 @@
           <w:sz w:val="20"/>
           <w:szCs w:val="20"/>
         </w:rPr>
-        <w:t>{{schoolName}}</w:t>
+        <w:t>{{</w:t>
+      </w:r>
+      <w:r>
+        <w:rPr>
+          <w:sz w:val="20"/>
+          <w:szCs w:val="20"/>
+          <w:lang w:val="en-US"/>
+        </w:rPr>
+        <w:t>schoolName</w:t>
+      </w:r>
+      <w:r>
+        <w:rPr>
+          <w:sz w:val="20"/>
+          <w:szCs w:val="20"/>
+        </w:rPr>
+        <w:t>}}</w:t>
       </w:r>
     </w:p>
     <w:p>
@@ -159,13 +1236,38 @@
           <w:sz w:val="20"/>
           <w:szCs w:val="20"/>
         </w:rPr>
-        <w:t>{{directorName}}</w:t>
-      </w:r>
-      <w:r>
-        <w:rPr>
-          <w:sz w:val="20"/>
-        </w:rPr>
-        <w:t>/ __________/</w:t>
+        <w:t>{{</w:t>
+      </w:r>
+      <w:proofErr w:type="gramStart"/>
+      <w:r>
+        <w:rPr>
+          <w:sz w:val="20"/>
+          <w:szCs w:val="20"/>
+          <w:lang w:val="en-US"/>
+        </w:rPr>
+        <w:t>directorName</w:t>
+      </w:r>
+      <w:r>
+        <w:rPr>
+          <w:sz w:val="20"/>
+          <w:szCs w:val="20"/>
+        </w:rPr>
+        <w:t xml:space="preserve"> </w:t>
+      </w:r>
+      <w:r>
+        <w:rPr>
+          <w:sz w:val="20"/>
+          <w:szCs w:val="20"/>
+        </w:rPr>
+        <w:t>}</w:t>
+      </w:r>
+      <w:proofErr w:type="gramEnd"/>
+      <w:r>
+        <w:rPr>
+          <w:sz w:val="20"/>
+          <w:szCs w:val="20"/>
+        </w:rPr>
+        <w:t>}</w:t>
       </w:r>
     </w:p>
     <w:p>
@@ -184,13 +1286,113 @@
           <w:sz w:val="20"/>
           <w:szCs w:val="20"/>
         </w:rPr>
-        <w:t>{{deputyName}}</w:t>
-      </w:r>
-      <w:r>
-        <w:rPr>
-          <w:sz w:val="20"/>
-        </w:rPr>
-        <w:t>/ ________</w:t>
+        <w:t>{{</w:t>
+      </w:r>
+      <w:proofErr w:type="spellStart"/>
+      <w:r>
+        <w:rPr>
+          <w:sz w:val="20"/>
+          <w:szCs w:val="20"/>
+        </w:rPr>
+        <w:t>deputyName</w:t>
+      </w:r>
+      <w:proofErr w:type="spellEnd"/>
+      <w:r>
+        <w:rPr>
+          <w:sz w:val="20"/>
+          <w:szCs w:val="20"/>
+        </w:rPr>
+        <w:t>}}</w:t>
+      </w:r>
+    </w:p>
+    <w:p>
+      <w:pPr>
+        <w:spacing w:after="0" w:line="267" w:lineRule="auto"/>
+        <w:ind w:left="0" w:right="220" w:firstLine="0"/>
+        <w:rPr>
+          <w:sz w:val="20"/>
+        </w:rPr>
+      </w:pPr>
+      <w:r>
+        <w:rPr>
+          <w:sz w:val="20"/>
+        </w:rPr>
+        <w:t xml:space="preserve">Классный руководитель </w:t>
+      </w:r>
+      <w:r>
+        <w:rPr>
+          <w:sz w:val="20"/>
+          <w:szCs w:val="20"/>
+        </w:rPr>
+        <w:t>{{</w:t>
+      </w:r>
+      <w:r>
+        <w:rPr>
+          <w:sz w:val="20"/>
+          <w:szCs w:val="20"/>
+          <w:lang w:val="en-US"/>
+        </w:rPr>
+        <w:t>classLeaderName</w:t>
+      </w:r>
+      <w:r>
+        <w:rPr>
+          <w:sz w:val="20"/>
+          <w:szCs w:val="20"/>
+        </w:rPr>
+        <w:t>}}</w:t>
+      </w:r>
+      <w:r>
+        <w:rPr>
+          <w:sz w:val="20"/>
+        </w:rPr>
+        <w:t>/</w:t>
+      </w:r>
+      <w:r>
+        <w:rPr>
+          <w:sz w:val="20"/>
+        </w:rPr>
+        <w:t xml:space="preserve"> М.П. </w:t>
+      </w:r>
+    </w:p>
+    <w:p>
+      <w:pPr>
+        <w:spacing w:after="0" w:line="267" w:lineRule="auto"/>
+        <w:ind w:left="0" w:right="220" w:firstLine="0"/>
+      </w:pPr>
+      <w:r>
+        <w:rPr>
+          <w:sz w:val="20"/>
+        </w:rPr>
+        <w:t>Населенный пункт</w:t>
+      </w:r>
+      <w:r>
+        <w:rPr>
+          <w:sz w:val="20"/>
+        </w:rPr>
+        <w:t xml:space="preserve"> </w:t>
+      </w:r>
+      <w:r>
+        <w:rPr>
+          <w:sz w:val="20"/>
+          <w:szCs w:val="20"/>
+        </w:rPr>
+        <w:t>{{</w:t>
+      </w:r>
+      <w:proofErr w:type="spellStart"/>
+      <w:r>
+        <w:rPr>
+          <w:sz w:val="20"/>
+          <w:szCs w:val="20"/>
+        </w:rPr>
+        <w:t>city</w:t>
+      </w:r>
+      <w:proofErr w:type="spellEnd"/>
+      <w:r>
+        <w:rPr>
+          <w:sz w:val="20"/>
+          <w:szCs w:val="20"/>
+        </w:rPr>
+        <w:t>}}</w:t>
       </w:r>
     </w:p>
     <w:p>
@@ -202,56 +1404,6 @@
         <w:rPr>
           <w:sz w:val="20"/>
         </w:rPr>
-        <w:t>/</w:t>
-      </w:r>
-    </w:p>
-    <w:p>
-      <w:pPr>
-        <w:spacing w:after="0" w:line="267" w:lineRule="auto"/>
-        <w:ind w:left="0" w:right="220" w:firstLine="0"/>
-      </w:pPr>
-      <w:r>
-        <w:rPr>
-          <w:sz w:val="20"/>
-        </w:rPr>
-        <w:t xml:space="preserve">Классный руководитель </w:t>
-      </w:r>
-      <w:r>
-        <w:rPr>
-          <w:sz w:val="20"/>
-          <w:szCs w:val="20"/>
-        </w:rPr>
-        <w:t>{{ classLeaderName}}</w:t>
-      </w:r>
-      <w:r>
-        <w:rPr>
-          <w:sz w:val="20"/>
-        </w:rPr>
-        <w:t>/ _______/ М.П. Населенный пункт</w:t>
-      </w:r>
-      <w:r>
-        <w:rPr>
-          <w:sz w:val="20"/>
-        </w:rPr>
-        <w:t xml:space="preserve"> </w:t>
-      </w:r>
-      <w:r>
-        <w:rPr>
-          <w:sz w:val="20"/>
-          <w:szCs w:val="20"/>
-        </w:rPr>
-        <w:t>{{city}}</w:t>
-      </w:r>
-    </w:p>
-    <w:p>
-      <w:pPr>
-        <w:spacing w:after="8" w:line="259" w:lineRule="auto"/>
-        <w:ind w:left="0" w:firstLine="0"/>
-      </w:pPr>
-      <w:r>
-        <w:rPr>
-          <w:sz w:val="20"/>
-        </w:rPr>
         <w:t xml:space="preserve">Выдан </w:t>
       </w:r>
       <w:r>
@@ -259,13 +1411,46 @@
           <w:sz w:val="20"/>
           <w:szCs w:val="20"/>
         </w:rPr>
-        <w:t xml:space="preserve">"{{issueDate}}" </w:t>
-      </w:r>
-      <w:r>
-        <w:rPr>
-          <w:sz w:val="20"/>
-        </w:rPr>
-        <w:t>_______________ года</w:t>
+        <w:t>"{{</w:t>
+      </w:r>
+      <w:proofErr w:type="spellStart"/>
+      <w:r>
+        <w:rPr>
+          <w:sz w:val="20"/>
+          <w:szCs w:val="20"/>
+          <w:lang w:val="en-US"/>
+        </w:rPr>
+        <w:t>issue</w:t>
+      </w:r>
+      <w:r>
+        <w:rPr>
+          <w:sz w:val="20"/>
+          <w:szCs w:val="20"/>
+          <w:lang w:val="en-US"/>
+        </w:rPr>
+        <w:t>D</w:t>
+      </w:r>
+      <w:r>
+        <w:rPr>
+          <w:sz w:val="20"/>
+          <w:szCs w:val="20"/>
+          <w:lang w:val="en-US"/>
+        </w:rPr>
+        <w:t>ate</w:t>
+      </w:r>
+      <w:proofErr w:type="spellEnd"/>
+      <w:r>
+        <w:rPr>
+          <w:sz w:val="20"/>
+          <w:szCs w:val="20"/>
+        </w:rPr>
+        <w:t>}}"</w:t>
+      </w:r>
+      <w:r>
+        <w:rPr>
+          <w:sz w:val="20"/>
+        </w:rPr>
+        <w:t xml:space="preserve"> года</w:t>
       </w:r>
     </w:p>
     <w:p>
@@ -286,7 +1471,6 @@
         <w:rPr>
           <w:sz w:val="20"/>
           <w:szCs w:val="20"/>
-          <w:lang w:val="en-US"/>
         </w:rPr>
         <w:t>{</w:t>
       </w:r>
@@ -294,17 +1478,19 @@
         <w:rPr>
           <w:sz w:val="20"/>
           <w:szCs w:val="20"/>
-        </w:rPr>
-        <w:t xml:space="preserve"> regNumber</w:t>
-      </w:r>
-      <w:r>
-        <w:rPr>
-          <w:sz w:val="20"/>
-          <w:szCs w:val="20"/>
-          <w:lang w:val="en-US"/>
+          <w:lang w:val="en-US"/>
+        </w:rPr>
+        <w:t>issueDate</w:t>
+      </w:r>
+      <w:r>
+        <w:rPr>
+          <w:sz w:val="20"/>
+          <w:szCs w:val="20"/>
         </w:rPr>
         <w:t>}}</w:t>
       </w:r>
+      <w:bookmarkStart w:id="0" w:name="_GoBack"/>
+      <w:bookmarkEnd w:id="0"/>
     </w:p>
     <w:sectPr>
       <w:pgSz w:w="11906" w:h="16838"/>
@@ -709,7 +1895,7 @@
   <w:style w:type="paragraph" w:default="1" w:styleId="a">
     <w:name w:val="Normal"/>
     <w:qFormat/>
-    <w:rsid w:val="00F82D86"/>
+    <w:rsid w:val="0036019B"/>
     <w:pPr>
       <w:spacing w:after="627" w:line="265" w:lineRule="auto"/>
       <w:ind w:left="10" w:hanging="10"/>

</xml_diff>